<commit_message>
Teach the complete Bug2 leave rule and name allowed functions in A3
The lesson now states that Bug2 leaves only where it meets the m-line
again closer to the goal than the hit point; seeing the goal is not
enough. Assignment 1 explains why its corner is not the leave point, and
Assignment 3 lists the functions available in its sandbox.
</commit_message>
<xml_diff>
--- a/course_materials/content/Obstacle Avoidance/Obstacle Avoidance.docx
+++ b/course_materials/content/Obstacle Avoidance/Obstacle Avoidance.docx
@@ -2092,7 +2092,7 @@
           <w:szCs w:val="24"/>
           <w:rtl w:val="0"/>
         </w:rPr>
-        <w:t xml:space="preserve"> When the robot, while following the obstacle's edge, finds a point on the boundary that is closer to the goal than any encountered so far </w:t>
+        <w:t xml:space="preserve"> Each Bug variant has its own rule for where the robot may leave the obstacle (see Bug 1 and Bug 2 below). In every variant, the robot leaves only from a boundary point where the way straight toward the goal is clear, and then resumes moving directly towards the goal.</w:t>
       </w:r>
       <w:r>
         <w:rPr>
@@ -2102,16 +2102,14 @@
           <w:szCs w:val="24"/>
           <w:rtl w:val="0"/>
         </w:rPr>
-        <w:t xml:space="preserve">and</w:t>
-      </w:r>
-      <w:r>
-        <w:rPr>
-          <w:rFonts w:ascii="Times New Roman" w:cs="Times New Roman" w:eastAsia="Times New Roman" w:hAnsi="Times New Roman"/>
-          <w:sz w:val="24"/>
-          <w:szCs w:val="24"/>
-          <w:rtl w:val="0"/>
-        </w:rPr>
-        <w:t xml:space="preserve"> also lies on the direct line of sight to the goal, it leaves the obstacle and resumes moving directly towards the goal.</w:t>
+      </w:r>
+      <w:r>
+        <w:rPr>
+          <w:rFonts w:ascii="Times New Roman" w:cs="Times New Roman" w:eastAsia="Times New Roman" w:hAnsi="Times New Roman"/>
+          <w:sz w:val="24"/>
+          <w:szCs w:val="24"/>
+          <w:rtl w:val="0"/>
+        </w:rPr>
       </w:r>
     </w:p>
     <w:p>
@@ -2201,7 +2199,7 @@
           <w:szCs w:val="24"/>
           <w:rtl w:val="0"/>
         </w:rPr>
-        <w:t xml:space="preserve"> Improves efficiency. Upon encountering an obstacle, the robot places a virtual 'leaving marker' (the hit point). While going around the obstacle, if it intersects its original straight-line trajectory </w:t>
+        <w:t xml:space="preserve"> Improves efficiency. The robot remembers the straight line from its start to the goal (the m-line) and the point where it first hit the obstacle (the hit point). While going around the obstacle, it leaves as soon as it reaches the m-line again at a point that is closer to the goal than the hit point and the way toward the goal is clear. This usually shortens the detour compared with Bug 1.</w:t>
       </w:r>
       <w:r>
         <w:rPr>
@@ -2211,16 +2209,14 @@
           <w:szCs w:val="24"/>
           <w:rtl w:val="0"/>
         </w:rPr>
-        <w:t xml:space="preserve">before</w:t>
-      </w:r>
-      <w:r>
-        <w:rPr>
-          <w:rFonts w:ascii="Times New Roman" w:cs="Times New Roman" w:eastAsia="Times New Roman" w:hAnsi="Times New Roman"/>
-          <w:sz w:val="24"/>
-          <w:szCs w:val="24"/>
-          <w:rtl w:val="0"/>
-        </w:rPr>
-        <w:t xml:space="preserve"> returning to the hit point, it can leave the obstacle earlier and shorten the circumnavigation.</w:t>
+      </w:r>
+      <w:r>
+        <w:rPr>
+          <w:rFonts w:ascii="Times New Roman" w:cs="Times New Roman" w:eastAsia="Times New Roman" w:hAnsi="Times New Roman"/>
+          <w:sz w:val="24"/>
+          <w:szCs w:val="24"/>
+          <w:rtl w:val="0"/>
+        </w:rPr>
       </w:r>
     </w:p>
     <w:p>
@@ -2420,7 +2416,7 @@
           <w:szCs w:val="24"/>
           <w:rtl w:val="0"/>
         </w:rPr>
-        <w:t xml:space="preserve">With Bug2 the robot begins to follow the object’s contour but departs immediately when it can move directly toward the goal. In general, this improved Bug algorithm will have significantly shorter total robot travel, as shown in figure. However, one can still construct situations in which Bug2 is arbitrarily inefficient (i.e., nonoptimal).</w:t>
+        <w:t>With Bug2 the robot begins to follow the object’s contour and departs as soon as it meets the m-line again at a point closer to the goal than its hit point. Seeing the goal is not enough on its own: if the goal becomes visible somewhere else on the boundary, such as at a corner, the robot keeps following the boundary until it is back on the m-line. In general, this improved Bug algorithm will have significantly shorter total robot travel, as shown in figure. However, one can still construct situations in which Bug2 is arbitrarily inefficient (i.e., nonoptimal).</w:t>
       </w:r>
     </w:p>
     <w:p>

</xml_diff>